<commit_message>
ADDING TODAY'S WORK - 28.07.2026
</commit_message>
<xml_diff>
--- a/write_up/drafts/2_introduction/introduction_DRAFT_3.docx
+++ b/write_up/drafts/2_introduction/introduction_DRAFT_3.docx
@@ -48,19 +48,7 @@
           <w:rPr>
             <w:rStyle w:val="Hyperlink"/>
           </w:rPr>
-          <w:t>https://pmc.ncbi.nlm.nih.gov/articles/PMC</w:t>
-        </w:r>
-        <w:r>
-          <w:rPr>
-            <w:rStyle w:val="Hyperlink"/>
-          </w:rPr>
-          <w:t>7</w:t>
-        </w:r>
-        <w:r>
-          <w:rPr>
-            <w:rStyle w:val="Hyperlink"/>
-          </w:rPr>
-          <w:t>118214/</w:t>
+          <w:t>https://pmc.ncbi.nlm.nih.gov/articles/PMC7118214/</w:t>
         </w:r>
       </w:hyperlink>
       <w:r>
@@ -91,19 +79,7 @@
           <w:rPr>
             <w:rStyle w:val="Hyperlink"/>
           </w:rPr>
-          <w:t>https://link.springer.com/article/10.1007/s11033-0</w:t>
-        </w:r>
-        <w:r>
-          <w:rPr>
-            <w:rStyle w:val="Hyperlink"/>
-          </w:rPr>
-          <w:t>2</w:t>
-        </w:r>
-        <w:r>
-          <w:rPr>
-            <w:rStyle w:val="Hyperlink"/>
-          </w:rPr>
-          <w:t>3-08624-w</w:t>
+          <w:t>https://link.springer.com/article/10.1007/s11033-023-08624-w</w:t>
         </w:r>
       </w:hyperlink>
       <w:r>
@@ -209,19 +185,7 @@
     </w:p>
     <w:p>
       <w:r>
-        <w:t xml:space="preserve">This cargo consists of various biomolecules including microRNAs (miRNAs), </w:t>
-      </w:r>
-      <w:r>
-        <w:t xml:space="preserve">which are </w:t>
-      </w:r>
-      <w:r>
-        <w:t>small non-coding RNAs</w:t>
-      </w:r>
-      <w:r>
-        <w:t xml:space="preserve"> </w:t>
-      </w:r>
-      <w:r>
-        <w:t>approximately 18-30nt that exercise gene silencing through post-transcriptional degradation of mRNAs (</w:t>
+        <w:t>This cargo consists of various biomolecules including microRNAs (miRNAs), which are small non-coding RNAs approximately 18-30nt that exercise gene silencing through post-transcriptional degradation of mRNAs (</w:t>
       </w:r>
       <w:hyperlink r:id="rId13" w:history="1">
         <w:r>
@@ -265,19 +229,7 @@
     <w:p>
       <w:r>
         <w:lastRenderedPageBreak/>
-        <w:t xml:space="preserve">EV miRNA cargo </w:t>
-      </w:r>
-      <w:r>
-        <w:t>has been shown to</w:t>
-      </w:r>
-      <w:r>
-        <w:t xml:space="preserve"> change upon exposure </w:t>
-      </w:r>
-      <w:r>
-        <w:t xml:space="preserve">to allergens </w:t>
-      </w:r>
-      <w:r>
-        <w:t>and between healthy individuals and respiratory disease sufferers (</w:t>
+        <w:t>EV miRNA cargo has been shown to change upon exposure to allergens and between healthy individuals and respiratory disease sufferers (</w:t>
       </w:r>
       <w:hyperlink r:id="rId16" w:history="1">
         <w:r>
@@ -315,19 +267,7 @@
     </w:p>
     <w:p>
       <w:r>
-        <w:t>Common allergens</w:t>
-      </w:r>
-      <w:r>
-        <w:t xml:space="preserve"> known to trigger inflammatory responses</w:t>
-      </w:r>
-      <w:r>
-        <w:t xml:space="preserve"> include house dust mite (HDM), dog allergens and protease enzyme allergens, found in many household cleaning products</w:t>
-      </w:r>
-      <w:r>
-        <w:t xml:space="preserve"> (GH/WB references)</w:t>
-      </w:r>
-      <w:r>
-        <w:t xml:space="preserve">. </w:t>
+        <w:t xml:space="preserve">Common allergens known to trigger inflammatory responses include house dust mite (HDM), dog allergens and protease enzyme allergens, found in many household cleaning products (GH/WB references). </w:t>
       </w:r>
     </w:p>
     <w:p>
@@ -496,6 +436,125 @@
     </w:p>
     <w:p>
       <w:pPr>
+        <w:rPr>
+          <w:rFonts w:ascii="Aptos" w:eastAsia="Times New Roman" w:hAnsi="Aptos" w:cs="Calibri"/>
+          <w:color w:val="000000"/>
+          <w:lang w:eastAsia="en-GB"/>
+        </w:rPr>
+      </w:pPr>
+      <w:r>
+        <w:rPr>
+          <w:rFonts w:ascii="Aptos" w:eastAsia="Times New Roman" w:hAnsi="Aptos" w:cs="Calibri"/>
+          <w:color w:val="000000"/>
+          <w:lang w:eastAsia="en-GB"/>
+        </w:rPr>
+        <w:lastRenderedPageBreak/>
+        <w:t>This study aim</w:t>
+      </w:r>
+      <w:r>
+        <w:rPr>
+          <w:rFonts w:ascii="Aptos" w:eastAsia="Times New Roman" w:hAnsi="Aptos" w:cs="Calibri"/>
+          <w:color w:val="000000"/>
+          <w:lang w:eastAsia="en-GB"/>
+        </w:rPr>
+        <w:t>ed</w:t>
+      </w:r>
+      <w:r>
+        <w:rPr>
+          <w:rFonts w:ascii="Aptos" w:eastAsia="Times New Roman" w:hAnsi="Aptos" w:cs="Calibri"/>
+          <w:color w:val="000000"/>
+          <w:lang w:eastAsia="en-GB"/>
+        </w:rPr>
+        <w:t xml:space="preserve"> to create a transcriptomics workflow to </w:t>
+      </w:r>
+      <w:r>
+        <w:rPr>
+          <w:rFonts w:ascii="Aptos" w:eastAsia="Times New Roman" w:hAnsi="Aptos" w:cs="Calibri"/>
+          <w:color w:val="000000"/>
+          <w:lang w:eastAsia="en-GB"/>
+        </w:rPr>
+        <w:t>re-analyse</w:t>
+      </w:r>
+      <w:r>
+        <w:rPr>
+          <w:rFonts w:ascii="Aptos" w:eastAsia="Times New Roman" w:hAnsi="Aptos" w:cs="Calibri"/>
+          <w:color w:val="000000"/>
+          <w:lang w:eastAsia="en-GB"/>
+        </w:rPr>
+        <w:t xml:space="preserve"> small RNA-</w:t>
+      </w:r>
+      <w:proofErr w:type="spellStart"/>
+      <w:r>
+        <w:rPr>
+          <w:rFonts w:ascii="Aptos" w:eastAsia="Times New Roman" w:hAnsi="Aptos" w:cs="Calibri"/>
+          <w:color w:val="000000"/>
+          <w:lang w:eastAsia="en-GB"/>
+        </w:rPr>
+        <w:t>seq</w:t>
+      </w:r>
+      <w:proofErr w:type="spellEnd"/>
+      <w:r>
+        <w:rPr>
+          <w:rFonts w:ascii="Aptos" w:eastAsia="Times New Roman" w:hAnsi="Aptos" w:cs="Calibri"/>
+          <w:color w:val="000000"/>
+          <w:lang w:eastAsia="en-GB"/>
+        </w:rPr>
+        <w:t xml:space="preserve"> data</w:t>
+      </w:r>
+      <w:r>
+        <w:rPr>
+          <w:rFonts w:ascii="Aptos" w:eastAsia="Times New Roman" w:hAnsi="Aptos" w:cs="Calibri"/>
+          <w:color w:val="000000"/>
+          <w:lang w:eastAsia="en-GB"/>
+        </w:rPr>
+        <w:t xml:space="preserve"> generated in</w:t>
+      </w:r>
+      <w:r>
+        <w:rPr>
+          <w:rFonts w:ascii="Aptos" w:eastAsia="Times New Roman" w:hAnsi="Aptos" w:cs="Calibri"/>
+          <w:color w:val="000000"/>
+          <w:lang w:eastAsia="en-GB"/>
+        </w:rPr>
+        <w:t xml:space="preserve"> previous allergen studies</w:t>
+      </w:r>
+      <w:r>
+        <w:rPr>
+          <w:rFonts w:ascii="Aptos" w:eastAsia="Times New Roman" w:hAnsi="Aptos" w:cs="Calibri"/>
+          <w:color w:val="000000"/>
+          <w:lang w:eastAsia="en-GB"/>
+        </w:rPr>
+        <w:t xml:space="preserve"> </w:t>
+      </w:r>
+      <w:r>
+        <w:t xml:space="preserve">[GH/WB references]. </w:t>
+      </w:r>
+      <w:r>
+        <w:t>Whereas the previous analyses employed commercial services and platforms to conduct transcriptomics, this study uses exclusively open-source and open-access software</w:t>
+      </w:r>
+      <w:r>
+        <w:t xml:space="preserve">. The workflow </w:t>
+      </w:r>
+      <w:r>
+        <w:t xml:space="preserve">integrates sequencing data quality control, differential expression analysis and evaluates two approaches </w:t>
+      </w:r>
+      <w:r>
+        <w:t>to</w:t>
+      </w:r>
+      <w:r>
+        <w:t xml:space="preserve"> pathway enrichment analysis</w:t>
+      </w:r>
+      <w:r>
+        <w:t xml:space="preserve">, with a particular focus on identifying </w:t>
+      </w:r>
+      <w:r>
+        <w:rPr>
+          <w:rFonts w:ascii="Calibri" w:eastAsia="Times New Roman" w:hAnsi="Calibri" w:cs="Calibri"/>
+          <w:color w:val="000000"/>
+          <w:lang w:eastAsia="en-GB"/>
+        </w:rPr>
+        <w:t>immune and inflammatory pathways relevant to airway biology.</w:t>
+      </w:r>
+      <w:r>
         <w:rPr>
           <w:rFonts w:ascii="Aptos" w:eastAsia="Times New Roman" w:hAnsi="Aptos" w:cs="Calibri"/>
           <w:b/>
@@ -503,131 +562,15 @@
           <w:color w:val="000000"/>
           <w:lang w:eastAsia="en-GB"/>
         </w:rPr>
-      </w:pPr>
+        <w:t xml:space="preserve"> </w:t>
+      </w:r>
       <w:r>
         <w:rPr>
           <w:rFonts w:ascii="Aptos" w:eastAsia="Times New Roman" w:hAnsi="Aptos" w:cs="Calibri"/>
           <w:color w:val="000000"/>
           <w:lang w:eastAsia="en-GB"/>
         </w:rPr>
-        <w:lastRenderedPageBreak/>
-        <w:t>This study aim</w:t>
-      </w:r>
-      <w:r>
-        <w:rPr>
-          <w:rFonts w:ascii="Aptos" w:eastAsia="Times New Roman" w:hAnsi="Aptos" w:cs="Calibri"/>
-          <w:color w:val="000000"/>
-          <w:lang w:eastAsia="en-GB"/>
-        </w:rPr>
-        <w:t>ed</w:t>
-      </w:r>
-      <w:r>
-        <w:rPr>
-          <w:rFonts w:ascii="Aptos" w:eastAsia="Times New Roman" w:hAnsi="Aptos" w:cs="Calibri"/>
-          <w:color w:val="000000"/>
-          <w:lang w:eastAsia="en-GB"/>
-        </w:rPr>
-        <w:t xml:space="preserve"> to create a transcriptomics workflow to </w:t>
-      </w:r>
-      <w:r>
-        <w:rPr>
-          <w:rFonts w:ascii="Aptos" w:eastAsia="Times New Roman" w:hAnsi="Aptos" w:cs="Calibri"/>
-          <w:color w:val="000000"/>
-          <w:lang w:eastAsia="en-GB"/>
-        </w:rPr>
-        <w:t>re-analyse</w:t>
-      </w:r>
-      <w:r>
-        <w:rPr>
-          <w:rFonts w:ascii="Aptos" w:eastAsia="Times New Roman" w:hAnsi="Aptos" w:cs="Calibri"/>
-          <w:color w:val="000000"/>
-          <w:lang w:eastAsia="en-GB"/>
-        </w:rPr>
-        <w:t xml:space="preserve"> small RNA-</w:t>
-      </w:r>
-      <w:proofErr w:type="spellStart"/>
-      <w:r>
-        <w:rPr>
-          <w:rFonts w:ascii="Aptos" w:eastAsia="Times New Roman" w:hAnsi="Aptos" w:cs="Calibri"/>
-          <w:color w:val="000000"/>
-          <w:lang w:eastAsia="en-GB"/>
-        </w:rPr>
-        <w:t>seq</w:t>
-      </w:r>
-      <w:proofErr w:type="spellEnd"/>
-      <w:r>
-        <w:rPr>
-          <w:rFonts w:ascii="Aptos" w:eastAsia="Times New Roman" w:hAnsi="Aptos" w:cs="Calibri"/>
-          <w:color w:val="000000"/>
-          <w:lang w:eastAsia="en-GB"/>
-        </w:rPr>
-        <w:t xml:space="preserve"> data</w:t>
-      </w:r>
-      <w:r>
-        <w:rPr>
-          <w:rFonts w:ascii="Aptos" w:eastAsia="Times New Roman" w:hAnsi="Aptos" w:cs="Calibri"/>
-          <w:color w:val="000000"/>
-          <w:lang w:eastAsia="en-GB"/>
-        </w:rPr>
-        <w:t xml:space="preserve"> generated in</w:t>
-      </w:r>
-      <w:r>
-        <w:rPr>
-          <w:rFonts w:ascii="Aptos" w:eastAsia="Times New Roman" w:hAnsi="Aptos" w:cs="Calibri"/>
-          <w:color w:val="000000"/>
-          <w:lang w:eastAsia="en-GB"/>
-        </w:rPr>
-        <w:t xml:space="preserve"> previous allergen studies</w:t>
-      </w:r>
-      <w:r>
-        <w:rPr>
-          <w:rFonts w:ascii="Aptos" w:eastAsia="Times New Roman" w:hAnsi="Aptos" w:cs="Calibri"/>
-          <w:color w:val="000000"/>
-          <w:lang w:eastAsia="en-GB"/>
-        </w:rPr>
-        <w:t xml:space="preserve"> </w:t>
-      </w:r>
-      <w:r>
-        <w:t>[GH/WB references].</w:t>
-      </w:r>
-      <w:r>
-        <w:t xml:space="preserve"> </w:t>
-      </w:r>
-      <w:r>
-        <w:t>Whereas the previous analyses employed commercial services and platforms to conduct transcriptomics, this study uses exclusively open-source and open-access software</w:t>
-      </w:r>
-      <w:r>
-        <w:t xml:space="preserve">. The workflow </w:t>
-      </w:r>
-      <w:r>
-        <w:t xml:space="preserve">integrates sequencing data quality control, differential expression analysis and evaluates two approaches </w:t>
-      </w:r>
-      <w:r>
-        <w:t>to</w:t>
-      </w:r>
-      <w:r>
-        <w:t xml:space="preserve"> pathway enrichment analysis</w:t>
-      </w:r>
-      <w:r>
-        <w:t xml:space="preserve">, with a particular focus on identifying </w:t>
-      </w:r>
-      <w:r>
-        <w:rPr>
-          <w:rFonts w:ascii="Calibri" w:eastAsia="Times New Roman" w:hAnsi="Calibri" w:cs="Calibri"/>
-          <w:color w:val="000000"/>
-          <w:lang w:eastAsia="en-GB"/>
-        </w:rPr>
-        <w:t>immune and inflammatory pathways relevant to airway biology.</w:t>
-      </w:r>
-      <w:r>
-        <w:rPr>
-          <w:rFonts w:ascii="Aptos" w:eastAsia="Times New Roman" w:hAnsi="Aptos" w:cs="Calibri"/>
-          <w:b/>
-          <w:bCs/>
-          <w:color w:val="000000"/>
-          <w:lang w:eastAsia="en-GB"/>
-        </w:rPr>
-        <w:t xml:space="preserve"> </w:t>
+        <w:t xml:space="preserve">Pathway analysis had not been previously performed on the dataset from [WB reference] at the time of this study, accordingly this represents novel analysis. </w:t>
       </w:r>
       <w:r>
         <w:rPr>

</xml_diff>